<commit_message>
docs: refresh public resume evidence date
</commit_message>
<xml_diff>
--- a/resume/daniil-britov-python-developer.docx
+++ b/resume/daniil-britov-python-developer.docx
@@ -339,7 +339,7 @@
           <w:color w:val="52667A"/>
           <w:sz w:val="22"/>
         </w:rPr>
-        <w:t>347 тестов пройдено, 4 пропущено · измерено 2026-07-04.</w:t>
+        <w:t>347 тестов пройдено, 4 пропущено · измерено 2026-07-25.</w:t>
       </w:r>
     </w:p>
     <w:p>
@@ -441,7 +441,7 @@
           <w:color w:val="52667A"/>
           <w:sz w:val="22"/>
         </w:rPr>
-        <w:t>37 тестов пройдено · измерено 2026-07-04.</w:t>
+        <w:t>37 тестов пройдено · измерено 2026-07-25.</w:t>
       </w:r>
     </w:p>
     <w:p>
@@ -556,7 +556,7 @@
           <w:color w:val="52667A"/>
           <w:sz w:val="22"/>
         </w:rPr>
-        <w:t>19 тестов пройдено · измерено 2026-07-04.</w:t>
+        <w:t>19 тестов пройдено · измерено 2026-07-25.</w:t>
       </w:r>
     </w:p>
     <w:p>
@@ -658,7 +658,7 @@
           <w:color w:val="52667A"/>
           <w:sz w:val="22"/>
         </w:rPr>
-        <w:t>28 тестов пройдено · измерено 2026-07-04.</w:t>
+        <w:t>28 тестов пройдено · измерено 2026-07-25.</w:t>
       </w:r>
     </w:p>
     <w:p>
@@ -707,7 +707,7 @@
           <w:color w:val="52667A"/>
           <w:sz w:val="19"/>
         </w:rPr>
-        <w:t>(6 тестов пройдено, 2026-07-04).</w:t>
+        <w:t>(6 тестов пройдено, 2026-07-25).</w:t>
       </w:r>
     </w:p>
     <w:p>
@@ -748,7 +748,7 @@
           <w:color w:val="52667A"/>
           <w:sz w:val="19"/>
         </w:rPr>
-        <w:t>(6 тестов пройдено, 2026-07-04).</w:t>
+        <w:t>(6 тестов пройдено, 2026-07-25).</w:t>
       </w:r>
     </w:p>
     <w:p>
@@ -789,7 +789,7 @@
           <w:color w:val="52667A"/>
           <w:sz w:val="19"/>
         </w:rPr>
-        <w:t>(6 тестов пройдено, 5 пропущено, 2026-07-04).</w:t>
+        <w:t>(11 тестов пройдено, 2026-07-25).</w:t>
       </w:r>
     </w:p>
     <w:p>
@@ -830,7 +830,7 @@
           <w:color w:val="52667A"/>
           <w:sz w:val="19"/>
         </w:rPr>
-        <w:t>(11 тестов пройдено, 2026-07-04).</w:t>
+        <w:t>(11 тестов пройдено, 2026-07-25).</w:t>
       </w:r>
     </w:p>
     <w:p>
@@ -871,7 +871,7 @@
           <w:color w:val="52667A"/>
           <w:sz w:val="19"/>
         </w:rPr>
-        <w:t>(11 тестов пройдено, 2026-07-04).</w:t>
+        <w:t>(11 тестов пройдено, 2026-07-25).</w:t>
       </w:r>
     </w:p>
     <w:p>

</xml_diff>

<commit_message>
docs: update resume with ROLF leadership experience
</commit_message>
<xml_diff>
--- a/resume/daniil-britov-python-developer.docx
+++ b/resume/daniil-britov-python-developer.docx
@@ -119,6 +119,80 @@
         <w:pStyle w:val="Heading2"/>
       </w:pPr>
       <w:r>
+        <w:t>Желаемая должность</w:t>
+      </w:r>
+    </w:p>
+    <w:p>
+      <w:r>
+        <w:rPr>
+          <w:rFonts w:ascii="Calibri" w:hAnsi="Calibri"/>
+          <w:b/>
+          <w:i w:val="0"/>
+          <w:color w:val="243B53"/>
+          <w:sz w:val="22"/>
+        </w:rPr>
+        <w:t xml:space="preserve">Позиция: </w:t>
+      </w:r>
+      <w:r>
+        <w:rPr>
+          <w:rFonts w:ascii="Calibri" w:hAnsi="Calibri"/>
+          <w:b w:val="0"/>
+          <w:i w:val="0"/>
+          <w:color w:val="243B53"/>
+          <w:sz w:val="22"/>
+        </w:rPr>
+        <w:t>Python-разработчик / разработчик автоматизации для малого бизнеса</w:t>
+      </w:r>
+    </w:p>
+    <w:p>
+      <w:r>
+        <w:rPr>
+          <w:rFonts w:ascii="Calibri" w:hAnsi="Calibri"/>
+          <w:b/>
+          <w:i w:val="0"/>
+          <w:color w:val="243B53"/>
+          <w:sz w:val="22"/>
+        </w:rPr>
+        <w:t xml:space="preserve">Специализация: </w:t>
+      </w:r>
+      <w:r>
+        <w:rPr>
+          <w:rFonts w:ascii="Calibri" w:hAnsi="Calibri"/>
+          <w:b w:val="0"/>
+          <w:i w:val="0"/>
+          <w:color w:val="243B53"/>
+          <w:sz w:val="22"/>
+        </w:rPr>
+        <w:t>Telegram-боты, AI-помощники, сайты, CRM-логика, отчётность и интеграции</w:t>
+      </w:r>
+    </w:p>
+    <w:p>
+      <w:r>
+        <w:rPr>
+          <w:rFonts w:ascii="Calibri" w:hAnsi="Calibri"/>
+          <w:b/>
+          <w:i w:val="0"/>
+          <w:color w:val="243B53"/>
+          <w:sz w:val="22"/>
+        </w:rPr>
+        <w:t xml:space="preserve">Формат: </w:t>
+      </w:r>
+      <w:r>
+        <w:rPr>
+          <w:rFonts w:ascii="Calibri" w:hAnsi="Calibri"/>
+          <w:b w:val="0"/>
+          <w:i w:val="0"/>
+          <w:color w:val="243B53"/>
+          <w:sz w:val="22"/>
+        </w:rPr>
+        <w:t>Проектная работа, удалённо, частичная или полная занятость</w:t>
+      </w:r>
+    </w:p>
+    <w:p>
+      <w:pPr>
+        <w:pStyle w:val="Heading2"/>
+      </w:pPr>
+      <w:r>
         <w:t>Профиль</w:t>
       </w:r>
     </w:p>
@@ -140,6 +214,267 @@
           <w:sz w:val="22"/>
         </w:rPr>
         <w:t>Открыт к проектам малого бизнеса</w:t>
+      </w:r>
+    </w:p>
+    <w:p>
+      <w:pPr>
+        <w:pStyle w:val="Heading2"/>
+      </w:pPr>
+      <w:r>
+        <w:t>Опыт работы</w:t>
+      </w:r>
+    </w:p>
+    <w:p>
+      <w:pPr>
+        <w:pStyle w:val="Heading3"/>
+      </w:pPr>
+      <w:r>
+        <w:rPr>
+          <w:rFonts w:ascii="Calibri" w:hAnsi="Calibri"/>
+          <w:b/>
+          <w:i w:val="0"/>
+          <w:color w:val="52667A"/>
+          <w:sz w:val="22"/>
+        </w:rPr>
+        <w:t>2021 — настоящее время  ·  6 лет в компании</w:t>
+      </w:r>
+    </w:p>
+    <w:p>
+      <w:r>
+        <w:rPr>
+          <w:rFonts w:ascii="Calibri" w:hAnsi="Calibri"/>
+          <w:b/>
+          <w:i w:val="0"/>
+          <w:color w:val="243B53"/>
+          <w:sz w:val="22"/>
+        </w:rPr>
+        <w:t>РОЛЬФ — автомобили с пробегом, Россия</w:t>
+      </w:r>
+    </w:p>
+    <w:p>
+      <w:r>
+        <w:rPr>
+          <w:rFonts w:ascii="Calibri" w:hAnsi="Calibri"/>
+          <w:b/>
+          <w:i w:val="0"/>
+          <w:color w:val="102A43"/>
+          <w:sz w:val="22"/>
+        </w:rPr>
+        <w:t>Руководитель отдела продаж автомобилей с пробегом</w:t>
+      </w:r>
+    </w:p>
+    <w:p>
+      <w:pPr>
+        <w:keepLines/>
+      </w:pPr>
+      <w:r>
+        <w:t>Карьерный рост внутри компании: продавец-стажёр → продавец-консультант → руководитель отдела продаж.</w:t>
+      </w:r>
+    </w:p>
+    <w:p>
+      <w:pPr>
+        <w:pStyle w:val="Heading3"/>
+      </w:pPr>
+      <w:r>
+        <w:t>Основные обязанности:</w:t>
+      </w:r>
+    </w:p>
+    <w:p>
+      <w:pPr>
+        <w:numPr>
+          <w:ilvl w:val="0"/>
+          <w:numId w:val="10"/>
+        </w:numPr>
+        <w:pStyle w:val="ResumeBullet"/>
+      </w:pPr>
+      <w:r>
+        <w:rPr>
+          <w:rFonts w:ascii="Calibri" w:hAnsi="Calibri"/>
+          <w:b w:val="0"/>
+          <w:i w:val="0"/>
+          <w:color w:val="243B53"/>
+          <w:sz w:val="22"/>
+        </w:rPr>
+        <w:t>Прогнозирование, контроль и выполнение плановых показателей отдела по ключевым KPI.</w:t>
+      </w:r>
+    </w:p>
+    <w:p>
+      <w:pPr>
+        <w:numPr>
+          <w:ilvl w:val="0"/>
+          <w:numId w:val="10"/>
+        </w:numPr>
+        <w:pStyle w:val="ResumeBullet"/>
+      </w:pPr>
+      <w:r>
+        <w:rPr>
+          <w:rFonts w:ascii="Calibri" w:hAnsi="Calibri"/>
+          <w:b w:val="0"/>
+          <w:i w:val="0"/>
+          <w:color w:val="243B53"/>
+          <w:sz w:val="22"/>
+        </w:rPr>
+        <w:t>Контроль плана дня, месяца и квартала; разбор промежуточных результатов и корректировка действий команды.</w:t>
+      </w:r>
+    </w:p>
+    <w:p>
+      <w:pPr>
+        <w:numPr>
+          <w:ilvl w:val="0"/>
+          <w:numId w:val="10"/>
+        </w:numPr>
+        <w:pStyle w:val="ResumeBullet"/>
+      </w:pPr>
+      <w:r>
+        <w:rPr>
+          <w:rFonts w:ascii="Calibri" w:hAnsi="Calibri"/>
+          <w:b w:val="0"/>
+          <w:i w:val="0"/>
+          <w:color w:val="243B53"/>
+          <w:sz w:val="22"/>
+        </w:rPr>
+        <w:t>Собеседования, трудоустройство, адаптация, обучение и внедрение новых сотрудников в рабочие процессы.</w:t>
+      </w:r>
+    </w:p>
+    <w:p>
+      <w:pPr>
+        <w:numPr>
+          <w:ilvl w:val="0"/>
+          <w:numId w:val="10"/>
+        </w:numPr>
+        <w:pStyle w:val="ResumeBullet"/>
+      </w:pPr>
+      <w:r>
+        <w:rPr>
+          <w:rFonts w:ascii="Calibri" w:hAnsi="Calibri"/>
+          <w:b w:val="0"/>
+          <w:i w:val="0"/>
+          <w:color w:val="243B53"/>
+          <w:sz w:val="22"/>
+        </w:rPr>
+        <w:t>Работа с CRM: контроль корректности ведения сделок, статусов, задач, клиентской истории и дисциплины отдела.</w:t>
+      </w:r>
+    </w:p>
+    <w:p>
+      <w:pPr>
+        <w:numPr>
+          <w:ilvl w:val="0"/>
+          <w:numId w:val="10"/>
+        </w:numPr>
+        <w:pStyle w:val="ResumeBullet"/>
+      </w:pPr>
+      <w:r>
+        <w:rPr>
+          <w:rFonts w:ascii="Calibri" w:hAnsi="Calibri"/>
+          <w:b w:val="0"/>
+          <w:i w:val="0"/>
+          <w:color w:val="243B53"/>
+          <w:sz w:val="22"/>
+        </w:rPr>
+        <w:t>Подготовка и ведение управленческих таблиц: Excel, формулы, графики, расчёты, отчётность, R/R и аналитика по показателям.</w:t>
+      </w:r>
+    </w:p>
+    <w:p>
+      <w:pPr>
+        <w:numPr>
+          <w:ilvl w:val="0"/>
+          <w:numId w:val="10"/>
+        </w:numPr>
+        <w:pStyle w:val="ResumeBullet"/>
+      </w:pPr>
+      <w:r>
+        <w:rPr>
+          <w:rFonts w:ascii="Calibri" w:hAnsi="Calibri"/>
+          <w:b w:val="0"/>
+          <w:i w:val="0"/>
+          <w:color w:val="243B53"/>
+          <w:sz w:val="22"/>
+        </w:rPr>
+        <w:t>Согласование условий по сделкам, взаимодействие с клиентами и сотрудниками, проведение рабочих встреч и собраний отдела.</w:t>
+      </w:r>
+    </w:p>
+    <w:p>
+      <w:pPr>
+        <w:numPr>
+          <w:ilvl w:val="0"/>
+          <w:numId w:val="10"/>
+        </w:numPr>
+        <w:pStyle w:val="ResumeBullet"/>
+      </w:pPr>
+      <w:r>
+        <w:rPr>
+          <w:rFonts w:ascii="Calibri" w:hAnsi="Calibri"/>
+          <w:b w:val="0"/>
+          <w:i w:val="0"/>
+          <w:color w:val="243B53"/>
+          <w:sz w:val="22"/>
+        </w:rPr>
+        <w:t>Коммуникация с претензионными клиентами и участие в досудебном урегулировании спорных ситуаций.</w:t>
+      </w:r>
+    </w:p>
+    <w:p>
+      <w:pPr>
+        <w:pStyle w:val="Heading3"/>
+      </w:pPr>
+      <w:r>
+        <w:t>Достижения и сильные стороны опыта:</w:t>
+      </w:r>
+    </w:p>
+    <w:p>
+      <w:pPr>
+        <w:numPr>
+          <w:ilvl w:val="0"/>
+          <w:numId w:val="10"/>
+        </w:numPr>
+        <w:pStyle w:val="ResumeBullet"/>
+      </w:pPr>
+      <w:r>
+        <w:rPr>
+          <w:rFonts w:ascii="Calibri" w:hAnsi="Calibri"/>
+          <w:b w:val="0"/>
+          <w:i w:val="0"/>
+          <w:color w:val="243B53"/>
+          <w:sz w:val="22"/>
+        </w:rPr>
+        <w:t>Прошёл путь от стартовой позиции в продажах до руководителя отдела внутри одной компании.</w:t>
+      </w:r>
+    </w:p>
+    <w:p>
+      <w:pPr>
+        <w:numPr>
+          <w:ilvl w:val="0"/>
+          <w:numId w:val="10"/>
+        </w:numPr>
+        <w:pStyle w:val="ResumeBullet"/>
+      </w:pPr>
+      <w:r>
+        <w:rPr>
+          <w:rFonts w:ascii="Calibri" w:hAnsi="Calibri"/>
+          <w:b w:val="0"/>
+          <w:i w:val="0"/>
+          <w:color w:val="243B53"/>
+          <w:sz w:val="22"/>
+        </w:rPr>
+        <w:t>Получил практический опыт управления отделом, KPI, CRM-процессами, отчётностью и клиентскими конфликтами.</w:t>
+      </w:r>
+    </w:p>
+    <w:p>
+      <w:pPr>
+        <w:numPr>
+          <w:ilvl w:val="0"/>
+          <w:numId w:val="10"/>
+        </w:numPr>
+        <w:pStyle w:val="ResumeBullet"/>
+      </w:pPr>
+      <w:r>
+        <w:rPr>
+          <w:rFonts w:ascii="Calibri" w:hAnsi="Calibri"/>
+          <w:b w:val="0"/>
+          <w:i w:val="0"/>
+          <w:color w:val="243B53"/>
+          <w:sz w:val="22"/>
+        </w:rPr>
+        <w:t>Использую этот опыт в разработке: понимаю, какие инструменты реально нужны продажам, руководителям и малому бизнесу.</w:t>
       </w:r>
     </w:p>
     <w:p>
@@ -229,7 +564,7 @@
           <w:color w:val="52667A"/>
           <w:sz w:val="22"/>
         </w:rPr>
-        <w:t>Python · FastAPI · Telegram Bot API · SQLite · REST API · HTML/CSS/JavaScript · Docker · pytest · GitHub Actions</w:t>
+        <w:t>Python · FastAPI · Telegram Bot API · SQLite · REST API · HTML/CSS/JavaScript · Docker · pytest · GitHub Actions · CRM · Excel · KPI · управленческая отчётность</w:t>
       </w:r>
     </w:p>
     <w:p>
@@ -879,6 +1214,71 @@
         <w:pStyle w:val="Heading2"/>
       </w:pPr>
       <w:r>
+        <w:t>Обо мне</w:t>
+      </w:r>
+    </w:p>
+    <w:p>
+      <w:pPr>
+        <w:numPr>
+          <w:ilvl w:val="0"/>
+          <w:numId w:val="10"/>
+        </w:numPr>
+        <w:pStyle w:val="ResumeBullet"/>
+      </w:pPr>
+      <w:r>
+        <w:rPr>
+          <w:rFonts w:ascii="Calibri" w:hAnsi="Calibri"/>
+          <w:b w:val="0"/>
+          <w:i w:val="0"/>
+          <w:color w:val="243B53"/>
+          <w:sz w:val="22"/>
+        </w:rPr>
+        <w:t>Сильная сторона — соединяю разработку с реальным операционным опытом: продажи, CRM, KPI, отчётность, клиентский сервис и управление командой.</w:t>
+      </w:r>
+    </w:p>
+    <w:p>
+      <w:pPr>
+        <w:numPr>
+          <w:ilvl w:val="0"/>
+          <w:numId w:val="10"/>
+        </w:numPr>
+        <w:pStyle w:val="ResumeBullet"/>
+      </w:pPr>
+      <w:r>
+        <w:rPr>
+          <w:rFonts w:ascii="Calibri" w:hAnsi="Calibri"/>
+          <w:b w:val="0"/>
+          <w:i w:val="0"/>
+          <w:color w:val="243B53"/>
+          <w:sz w:val="22"/>
+        </w:rPr>
+        <w:t>Умею быстро разбирать бизнес-процесс, выделять ручные операции и превращать их в понятный сценарий: бот, сайт, API, таблица или внутренняя панель.</w:t>
+      </w:r>
+    </w:p>
+    <w:p>
+      <w:pPr>
+        <w:numPr>
+          <w:ilvl w:val="0"/>
+          <w:numId w:val="10"/>
+        </w:numPr>
+        <w:pStyle w:val="ResumeBullet"/>
+      </w:pPr>
+      <w:r>
+        <w:rPr>
+          <w:rFonts w:ascii="Calibri" w:hAnsi="Calibri"/>
+          <w:b w:val="0"/>
+          <w:i w:val="0"/>
+          <w:color w:val="243B53"/>
+          <w:sz w:val="22"/>
+        </w:rPr>
+        <w:t>Работаю аккуратно с фактами: не обещаю коммерческие показатели без входных данных и проверки, фиксирую ограничения демо-проектов.</w:t>
+      </w:r>
+    </w:p>
+    <w:p>
+      <w:pPr>
+        <w:pStyle w:val="Heading2"/>
+      </w:pPr>
+      <w:r>
         <w:t>Контакт</w:t>
       </w:r>
     </w:p>

</xml_diff>

<commit_message>
docs: connect ROLF experience with developer profile
</commit_message>
<xml_diff>
--- a/resume/daniil-britov-python-developer.docx
+++ b/resume/daniil-britov-python-developer.docx
@@ -201,7 +201,7 @@
         <w:keepLines/>
       </w:pPr>
       <w:r>
-        <w:t>Создаю для российского малого бизнеса Telegram-ботов, AI-помощников, API и сайты. Связываю веб-интерфейс, Telegram, базу данных и внешние сервисы в проверяемый рабочий сценарий.</w:t>
+        <w:t>Я иду в разработку из операционного управления продажами: 6 лет работаю в РОЛЬФ с планами, CRM, KPI, отчётностью, клиентскими обращениями и командой. Поэтому создаю не абстрактный код, а понятные бизнес-инструменты для российского малого бизнеса: Telegram-ботов, AI-помощников, API, сайты и внутренние панели, которые помогают принимать заявки, контролировать процессы и сокращать ручную работу.</w:t>
       </w:r>
     </w:p>
     <w:p>
@@ -214,6 +214,71 @@
           <w:sz w:val="22"/>
         </w:rPr>
         <w:t>Открыт к проектам малого бизнеса</w:t>
+      </w:r>
+    </w:p>
+    <w:p>
+      <w:pPr>
+        <w:pStyle w:val="Heading2"/>
+      </w:pPr>
+      <w:r>
+        <w:t>Как мой прошлый опыт связан с разработкой</w:t>
+      </w:r>
+    </w:p>
+    <w:p>
+      <w:pPr>
+        <w:numPr>
+          <w:ilvl w:val="0"/>
+          <w:numId w:val="10"/>
+        </w:numPr>
+        <w:pStyle w:val="ResumeBullet"/>
+      </w:pPr>
+      <w:r>
+        <w:rPr>
+          <w:rFonts w:ascii="Calibri" w:hAnsi="Calibri"/>
+          <w:b w:val="0"/>
+          <w:i w:val="0"/>
+          <w:color w:val="243B53"/>
+          <w:sz w:val="22"/>
+        </w:rPr>
+        <w:t>В продажах я каждый день видел, где бизнес теряет время: ручные таблицы, несвоевременные статусы в CRM, повторные сообщения клиентам, контроль планов и отчётность по KPI.</w:t>
+      </w:r>
+    </w:p>
+    <w:p>
+      <w:pPr>
+        <w:numPr>
+          <w:ilvl w:val="0"/>
+          <w:numId w:val="10"/>
+        </w:numPr>
+        <w:pStyle w:val="ResumeBullet"/>
+      </w:pPr>
+      <w:r>
+        <w:rPr>
+          <w:rFonts w:ascii="Calibri" w:hAnsi="Calibri"/>
+          <w:b w:val="0"/>
+          <w:i w:val="0"/>
+          <w:color w:val="243B53"/>
+          <w:sz w:val="22"/>
+        </w:rPr>
+        <w:t>В разработке я переношу этот опыт в продуктовую логику: сначала разбираю реальный процесс, затем проектирую бота, сайт, API или дашборд под конкретную задачу руководителя и команды.</w:t>
+      </w:r>
+    </w:p>
+    <w:p>
+      <w:pPr>
+        <w:numPr>
+          <w:ilvl w:val="0"/>
+          <w:numId w:val="10"/>
+        </w:numPr>
+        <w:pStyle w:val="ResumeBullet"/>
+      </w:pPr>
+      <w:r>
+        <w:rPr>
+          <w:rFonts w:ascii="Calibri" w:hAnsi="Calibri"/>
+          <w:b w:val="0"/>
+          <w:i w:val="0"/>
+          <w:color w:val="243B53"/>
+          <w:sz w:val="22"/>
+        </w:rPr>
+        <w:t>Для клиента это означает, что я понимаю не только код, но и рабочую сторону бизнеса: воронку, дисциплину CRM, коммуникацию с клиентом, управленческую отчётность и контроль результата.</w:t>
       </w:r>
     </w:p>
     <w:p>
@@ -474,7 +539,7 @@
           <w:color w:val="243B53"/>
           <w:sz w:val="22"/>
         </w:rPr>
-        <w:t>Использую этот опыт в разработке: понимаю, какие инструменты реально нужны продажам, руководителям и малому бизнесу.</w:t>
+        <w:t>Использую этот опыт как основу для разработки: понимаю, какие сценарии автоматизации реально нужны продажам, руководителям и малому бизнесу.</w:t>
       </w:r>
     </w:p>
     <w:p>
@@ -501,7 +566,7 @@
           <w:color w:val="243B53"/>
           <w:sz w:val="22"/>
         </w:rPr>
-        <w:t>Telegram-боты для заявок, записи, учёта и уведомлений</w:t>
+        <w:t>Telegram-боты для заявок, записи, учёта, уведомлений и контроля статусов</w:t>
       </w:r>
     </w:p>
     <w:p>
@@ -520,7 +585,7 @@
           <w:color w:val="243B53"/>
           <w:sz w:val="22"/>
         </w:rPr>
-        <w:t>AI-помощники с ответами по проверяемой базе знаний</w:t>
+        <w:t>AI-помощники с ответами по проверяемой базе знаний для клиентов и сотрудников</w:t>
       </w:r>
     </w:p>
     <w:p>
@@ -539,7 +604,7 @@
           <w:color w:val="243B53"/>
           <w:sz w:val="22"/>
         </w:rPr>
-        <w:t>Адаптивные сайты, API и интеграции с базами данных</w:t>
+        <w:t>Адаптивные сайты, API, CRM-логика, отчётность и интеграции с базами данных</w:t>
       </w:r>
     </w:p>
     <w:p>
@@ -777,11 +842,6 @@
           <w:sz w:val="22"/>
         </w:rPr>
         <w:t>37 тестов пройдено · измерено 2026-07-25.</w:t>
-      </w:r>
-    </w:p>
-    <w:p>
-      <w:r>
-        <w:br w:type="page"/>
       </w:r>
     </w:p>
     <w:p>
@@ -1233,7 +1293,7 @@
           <w:color w:val="243B53"/>
           <w:sz w:val="22"/>
         </w:rPr>
-        <w:t>Сильная сторона — соединяю разработку с реальным операционным опытом: продажи, CRM, KPI, отчётность, клиентский сервис и управление командой.</w:t>
+        <w:t>Моя сильная сторона — соединяю разработку с реальным операционным опытом: продажи, CRM, KPI, отчётность, клиентский сервис и управление командой.</w:t>
       </w:r>
     </w:p>
     <w:p>
@@ -1252,7 +1312,26 @@
           <w:color w:val="243B53"/>
           <w:sz w:val="22"/>
         </w:rPr>
-        <w:t>Умею быстро разбирать бизнес-процесс, выделять ручные операции и превращать их в понятный сценарий: бот, сайт, API, таблица или внутренняя панель.</w:t>
+        <w:t>Умею говорить с бизнесом на языке задач, а не только технологий: быстро разбираю процесс, выделяю ручные операции и превращаю их в понятный сценарий.</w:t>
+      </w:r>
+    </w:p>
+    <w:p>
+      <w:pPr>
+        <w:numPr>
+          <w:ilvl w:val="0"/>
+          <w:numId w:val="10"/>
+        </w:numPr>
+        <w:pStyle w:val="ResumeBullet"/>
+      </w:pPr>
+      <w:r>
+        <w:rPr>
+          <w:rFonts w:ascii="Calibri" w:hAnsi="Calibri"/>
+          <w:b w:val="0"/>
+          <w:i w:val="0"/>
+          <w:color w:val="243B53"/>
+          <w:sz w:val="22"/>
+        </w:rPr>
+        <w:t>Мне ближе прикладная разработка для малого бизнеса: бот для заявок, сайт с понятным CTA, API-интеграция, таблица, отчётность или внутренняя панель руководителя.</w:t>
       </w:r>
     </w:p>
     <w:p>

</xml_diff>

<commit_message>
docs: update resume target roles
</commit_message>
<xml_diff>
--- a/resume/daniil-britov-python-developer.docx
+++ b/resume/daniil-britov-python-developer.docx
@@ -29,7 +29,7 @@
           <w:color w:val="008A8A"/>
           <w:sz w:val="24"/>
         </w:rPr>
-        <w:t>Python-разработчик • Telegram-боты • AI • автоматизация</w:t>
+        <w:t>Python-разработчик • CRM • SalesOps • автоматизация</w:t>
       </w:r>
     </w:p>
     <w:p>
@@ -141,7 +141,7 @@
           <w:color w:val="243B53"/>
           <w:sz w:val="22"/>
         </w:rPr>
-        <w:t>Python-разработчик / разработчик автоматизации для малого бизнеса</w:t>
+        <w:t>Python-разработчик / CRM-администратор / SalesOps / бизнес-аналитик автоматизации / Product Management</w:t>
       </w:r>
     </w:p>
     <w:p>
@@ -163,7 +163,7 @@
           <w:color w:val="243B53"/>
           <w:sz w:val="22"/>
         </w:rPr>
-        <w:t>Telegram-боты, AI-помощники, сайты, CRM-логика, отчётность и интеграции</w:t>
+        <w:t>Автоматизация продаж и сервиса: Telegram-боты, AI-помощники, сайты, CRM-логика, отчётность, интеграции и продуктовая постановка задач</w:t>
       </w:r>
     </w:p>
     <w:p>
@@ -629,7 +629,7 @@
           <w:color w:val="52667A"/>
           <w:sz w:val="22"/>
         </w:rPr>
-        <w:t>Python · FastAPI · Telegram Bot API · SQLite · REST API · HTML/CSS/JavaScript · Docker · pytest · GitHub Actions · CRM · Excel · KPI · управленческая отчётность</w:t>
+        <w:t>Python · FastAPI · Telegram Bot API · SQLite · REST API · HTML/CSS/JavaScript · Docker · pytest · GitHub Actions · CRM-администрирование · SalesOps · бизнес-анализ · Product Management · Excel · KPI · управленческая отчётность</w:t>
       </w:r>
     </w:p>
     <w:p>

</xml_diff>

<commit_message>
docs: publish remote IT resume
</commit_message>
<xml_diff>
--- a/resume/daniil-britov-python-developer.docx
+++ b/resume/daniil-britov-python-developer.docx
@@ -29,7 +29,7 @@
           <w:color w:val="008A8A"/>
           <w:sz w:val="24"/>
         </w:rPr>
-        <w:t>Python-разработчик • CRM • SalesOps • автоматизация</w:t>
+        <w:t>CRM / SalesOps / Business Analyst / Python automation</w:t>
       </w:r>
     </w:p>
     <w:p>
@@ -141,7 +141,7 @@
           <w:color w:val="243B53"/>
           <w:sz w:val="22"/>
         </w:rPr>
-        <w:t>Python-разработчик / CRM-администратор / SalesOps / бизнес-аналитик автоматизации / Product Management</w:t>
+        <w:t>CRM-администратор / SalesOps-специалист / бизнес-аналитик автоматизации / Junior Product Manager / Python automation developer</w:t>
       </w:r>
     </w:p>
     <w:p>
@@ -163,7 +163,7 @@
           <w:color w:val="243B53"/>
           <w:sz w:val="22"/>
         </w:rPr>
-        <w:t>Автоматизация продаж и сервиса: Telegram-боты, AI-помощники, сайты, CRM-логика, отчётность, интеграции и продуктовая постановка задач</w:t>
+        <w:t>Автоматизация продаж и сервиса: CRM-процессы, воронки, KPI, отчётность, постановка задач, Telegram-боты, AI-помощники, API и внутренние панели</w:t>
       </w:r>
     </w:p>
     <w:p>
@@ -185,7 +185,7 @@
           <w:color w:val="243B53"/>
           <w:sz w:val="22"/>
         </w:rPr>
-        <w:t>Проектная работа, удалённо, частичная или полная занятость</w:t>
+        <w:t>Удалённая работа, гибридный формат или проектная занятость</w:t>
       </w:r>
     </w:p>
     <w:p>
@@ -201,7 +201,7 @@
         <w:keepLines/>
       </w:pPr>
       <w:r>
-        <w:t>Я иду в разработку из операционного управления продажами: 6 лет работаю в РОЛЬФ с планами, CRM, KPI, отчётностью, клиентскими обращениями и командой. Поэтому создаю не абстрактный код, а понятные бизнес-инструменты для российского малого бизнеса: Telegram-ботов, AI-помощников, API, сайты и внутренние панели, которые помогают принимать заявки, контролировать процессы и сокращать ручную работу.</w:t>
+        <w:t>Ищу удалённую IT-роль на стыке CRM, SalesOps, бизнес-анализа, Product Management и автоматизации. 6 лет работаю в РОЛЬФ в операционном управлении продажами: планы, KPI, CRM, Excel-отчётность, адаптация сотрудников, клиентские обращения и контроль процессов. Дополнительно собрал портфолио IT-проектов на Python, FastAPI, Telegram Bot API, SQLite, HTML/CSS/JS и GitHub Actions.</w:t>
       </w:r>
     </w:p>
     <w:p>
@@ -213,7 +213,7 @@
           <w:color w:val="008A8A"/>
           <w:sz w:val="22"/>
         </w:rPr>
-        <w:t>Открыт к проектам малого бизнеса</w:t>
+        <w:t>Готов к удалённой IT-работе и проектам по автоматизации бизнеса</w:t>
       </w:r>
     </w:p>
     <w:p>
@@ -221,7 +221,7 @@
         <w:pStyle w:val="Heading2"/>
       </w:pPr>
       <w:r>
-        <w:t>Как мой прошлый опыт связан с разработкой</w:t>
+        <w:t>Подходящие IT-роли</w:t>
       </w:r>
     </w:p>
     <w:p>
@@ -240,7 +240,7 @@
           <w:color w:val="243B53"/>
           <w:sz w:val="22"/>
         </w:rPr>
-        <w:t>В продажах я каждый день видел, где бизнес теряет время: ручные таблицы, несвоевременные статусы в CRM, повторные сообщения клиентам, контроль планов и отчётность по KPI.</w:t>
+        <w:t>CRM / SalesOps: понимаю воронку продаж, дисциплину CRM, статусы сделок, контроль KPI, план-факт и регулярную управленческую отчётность.</w:t>
       </w:r>
     </w:p>
     <w:p>
@@ -259,7 +259,7 @@
           <w:color w:val="243B53"/>
           <w:sz w:val="22"/>
         </w:rPr>
-        <w:t>В разработке я переношу этот опыт в продуктовую логику: сначала разбираю реальный процесс, затем проектирую бота, сайт, API или дашборд под конкретную задачу руководителя и команды.</w:t>
+        <w:t>Бизнес-анализ: умею разбирать процесс с руководителем и командой, находить ручные операции, формулировать требования и переводить их в понятный сценарий автоматизации.</w:t>
       </w:r>
     </w:p>
     <w:p>
@@ -278,7 +278,72 @@
           <w:color w:val="243B53"/>
           <w:sz w:val="22"/>
         </w:rPr>
-        <w:t>Для клиента это означает, что я понимаю не только код, но и рабочую сторону бизнеса: воронку, дисциплину CRM, коммуникацию с клиентом, управленческую отчётность и контроль результата.</w:t>
+        <w:t>Product / автоматизация: могу описать пользовательский сценарий, собрать MVP, проверить его тестами и показать рабочий демо-результат через сайт, бота, API или дашборд.</w:t>
+      </w:r>
+    </w:p>
+    <w:p>
+      <w:pPr>
+        <w:pStyle w:val="Heading2"/>
+      </w:pPr>
+      <w:r>
+        <w:t>Почему мой опыт релевантен IT</w:t>
+      </w:r>
+    </w:p>
+    <w:p>
+      <w:pPr>
+        <w:numPr>
+          <w:ilvl w:val="0"/>
+          <w:numId w:val="10"/>
+        </w:numPr>
+        <w:pStyle w:val="ResumeBullet"/>
+      </w:pPr>
+      <w:r>
+        <w:rPr>
+          <w:rFonts w:ascii="Calibri" w:hAnsi="Calibri"/>
+          <w:b w:val="0"/>
+          <w:i w:val="0"/>
+          <w:color w:val="243B53"/>
+          <w:sz w:val="22"/>
+        </w:rPr>
+        <w:t>Я знаю операционную сторону продаж изнутри: где появляются потери в CRM, KPI, отчётности, коммуникации с клиентом, контроле плана и передаче задач между сотрудниками.</w:t>
+      </w:r>
+    </w:p>
+    <w:p>
+      <w:pPr>
+        <w:numPr>
+          <w:ilvl w:val="0"/>
+          <w:numId w:val="10"/>
+        </w:numPr>
+        <w:pStyle w:val="ResumeBullet"/>
+      </w:pPr>
+      <w:r>
+        <w:rPr>
+          <w:rFonts w:ascii="Calibri" w:hAnsi="Calibri"/>
+          <w:b w:val="0"/>
+          <w:i w:val="0"/>
+          <w:color w:val="243B53"/>
+          <w:sz w:val="22"/>
+        </w:rPr>
+        <w:t>Поэтому в IT мне ближе прикладные роли: CRM-администрирование, SalesOps, бизнес-анализ, постановка задач, продуктовая логика и автоматизация ручных процессов.</w:t>
+      </w:r>
+    </w:p>
+    <w:p>
+      <w:pPr>
+        <w:numPr>
+          <w:ilvl w:val="0"/>
+          <w:numId w:val="10"/>
+        </w:numPr>
+        <w:pStyle w:val="ResumeBullet"/>
+      </w:pPr>
+      <w:r>
+        <w:rPr>
+          <w:rFonts w:ascii="Calibri" w:hAnsi="Calibri"/>
+          <w:b w:val="0"/>
+          <w:i w:val="0"/>
+          <w:color w:val="243B53"/>
+          <w:sz w:val="22"/>
+        </w:rPr>
+        <w:t>Портфолио показывает техническую базу: боты, сайты, API, веб-интерфейсы, тесты, демо-сценарии и аккуратная работа с ограничениями без выдуманных коммерческих результатов.</w:t>
       </w:r>
     </w:p>
     <w:p>
@@ -360,7 +425,7 @@
           <w:color w:val="243B53"/>
           <w:sz w:val="22"/>
         </w:rPr>
-        <w:t>Прогнозирование, контроль и выполнение плановых показателей отдела по ключевым KPI.</w:t>
+        <w:t>Прогнозирование, контроль и выполнение плановых показателей отдела по ключевым KPI: день, месяц, квартал.</w:t>
       </w:r>
     </w:p>
     <w:p>
@@ -379,7 +444,7 @@
           <w:color w:val="243B53"/>
           <w:sz w:val="22"/>
         </w:rPr>
-        <w:t>Контроль плана дня, месяца и квартала; разбор промежуточных результатов и корректировка действий команды.</w:t>
+        <w:t>Разбор промежуточных результатов, план-факт, корректировка действий команды и контроль управленческой отчётности.</w:t>
       </w:r>
     </w:p>
     <w:p>
@@ -520,7 +585,7 @@
           <w:color w:val="243B53"/>
           <w:sz w:val="22"/>
         </w:rPr>
-        <w:t>Получил практический опыт управления отделом, KPI, CRM-процессами, отчётностью и клиентскими конфликтами.</w:t>
+        <w:t>Получил практический опыт управления отделом, KPI, CRM-процессами, отчётностью, наймом, адаптацией и клиентскими конфликтами.</w:t>
       </w:r>
     </w:p>
     <w:p>
@@ -539,7 +604,7 @@
           <w:color w:val="243B53"/>
           <w:sz w:val="22"/>
         </w:rPr>
-        <w:t>Использую этот опыт как основу для разработки: понимаю, какие сценарии автоматизации реально нужны продажам, руководителям и малому бизнесу.</w:t>
+        <w:t>Использую этот опыт как основу для IT-ролей: понимаю, какие данные, статусы, отчёты и автоматизации реально нужны продажам и руководителям.</w:t>
       </w:r>
     </w:p>
     <w:p>
@@ -547,7 +612,7 @@
         <w:pStyle w:val="Heading2"/>
       </w:pPr>
       <w:r>
-        <w:t>Чем могу быть полезен</w:t>
+        <w:t>Что могу закрыть в IT-команде</w:t>
       </w:r>
     </w:p>
     <w:p>
@@ -566,7 +631,7 @@
           <w:color w:val="243B53"/>
           <w:sz w:val="22"/>
         </w:rPr>
-        <w:t>Telegram-боты для заявок, записи, учёта, уведомлений и контроля статусов</w:t>
+        <w:t>CRM-процессы: статусы, воронки, контроль заполнения, отчёты и логика задач</w:t>
       </w:r>
     </w:p>
     <w:p>
@@ -585,7 +650,7 @@
           <w:color w:val="243B53"/>
           <w:sz w:val="22"/>
         </w:rPr>
-        <w:t>AI-помощники с ответами по проверяемой базе знаний для клиентов и сотрудников</w:t>
+        <w:t>SalesOps и аналитика: KPI, план-факт, Excel-таблицы, расчёты, регулярная отчётность</w:t>
       </w:r>
     </w:p>
     <w:p>
@@ -604,7 +669,7 @@
           <w:color w:val="243B53"/>
           <w:sz w:val="22"/>
         </w:rPr>
-        <w:t>Адаптивные сайты, API, CRM-логика, отчётность и интеграции с базами данных</w:t>
+        <w:t>Автоматизация: Telegram-боты, AI-помощники, API, веб-интерфейсы и внутренние панели</w:t>
       </w:r>
     </w:p>
     <w:p>
@@ -629,7 +694,7 @@
           <w:color w:val="52667A"/>
           <w:sz w:val="22"/>
         </w:rPr>
-        <w:t>Python · FastAPI · Telegram Bot API · SQLite · REST API · HTML/CSS/JavaScript · Docker · pytest · GitHub Actions · CRM-администрирование · SalesOps · бизнес-анализ · Product Management · Excel · KPI · управленческая отчётность</w:t>
+        <w:t>CRM-администрирование · SalesOps · бизнес-анализ · Product Management · KPI · план-факт · Excel · управленческая отчётность · Python · FastAPI · Telegram Bot API · SQLite · REST API · HTML/CSS/JavaScript · Docker · pytest · GitHub Actions</w:t>
       </w:r>
     </w:p>
     <w:p>
@@ -1293,7 +1358,7 @@
           <w:color w:val="243B53"/>
           <w:sz w:val="22"/>
         </w:rPr>
-        <w:t>Моя сильная сторона — соединяю разработку с реальным операционным опытом: продажи, CRM, KPI, отчётность, клиентский сервис и управление командой.</w:t>
+        <w:t>Сильная сторона — соединяю бизнес-мышление с технической реализацией: понимаю продажи, CRM, KPI, отчётность, клиентский сервис и управление командой.</w:t>
       </w:r>
     </w:p>
     <w:p>
@@ -1312,7 +1377,7 @@
           <w:color w:val="243B53"/>
           <w:sz w:val="22"/>
         </w:rPr>
-        <w:t>Умею говорить с бизнесом на языке задач, а не только технологий: быстро разбираю процесс, выделяю ручные операции и превращаю их в понятный сценарий.</w:t>
+        <w:t>Умею говорить с бизнесом на языке задач: быстро разбираю процесс, выделяю ручные операции и превращаю их в требования, сценарии и рабочие прототипы.</w:t>
       </w:r>
     </w:p>
     <w:p>
@@ -1331,7 +1396,7 @@
           <w:color w:val="243B53"/>
           <w:sz w:val="22"/>
         </w:rPr>
-        <w:t>Мне ближе прикладная разработка для малого бизнеса: бот для заявок, сайт с понятным CTA, API-интеграция, таблица, отчётность или внутренняя панель руководителя.</w:t>
+        <w:t>Хочу развиваться в удалённой IT-роли, где нужен человек между бизнесом, CRM, аналитикой, продуктом и автоматизацией.</w:t>
       </w:r>
     </w:p>
     <w:p>
@@ -1351,6 +1416,71 @@
           <w:sz w:val="22"/>
         </w:rPr>
         <w:t>Работаю аккуратно с фактами: не обещаю коммерческие показатели без входных данных и проверки, фиксирую ограничения демо-проектов.</w:t>
+      </w:r>
+    </w:p>
+    <w:p>
+      <w:pPr>
+        <w:pStyle w:val="Heading2"/>
+      </w:pPr>
+      <w:r>
+        <w:t>Удалённый формат</w:t>
+      </w:r>
+    </w:p>
+    <w:p>
+      <w:pPr>
+        <w:numPr>
+          <w:ilvl w:val="0"/>
+          <w:numId w:val="10"/>
+        </w:numPr>
+        <w:pStyle w:val="ResumeBullet"/>
+      </w:pPr>
+      <w:r>
+        <w:rPr>
+          <w:rFonts w:ascii="Calibri" w:hAnsi="Calibri"/>
+          <w:b w:val="0"/>
+          <w:i w:val="0"/>
+          <w:color w:val="243B53"/>
+          <w:sz w:val="22"/>
+        </w:rPr>
+        <w:t>Привык работать с задачами, сроками, показателями и регулярной отчётностью.</w:t>
+      </w:r>
+    </w:p>
+    <w:p>
+      <w:pPr>
+        <w:numPr>
+          <w:ilvl w:val="0"/>
+          <w:numId w:val="10"/>
+        </w:numPr>
+        <w:pStyle w:val="ResumeBullet"/>
+      </w:pPr>
+      <w:r>
+        <w:rPr>
+          <w:rFonts w:ascii="Calibri" w:hAnsi="Calibri"/>
+          <w:b w:val="0"/>
+          <w:i w:val="0"/>
+          <w:color w:val="243B53"/>
+          <w:sz w:val="22"/>
+        </w:rPr>
+        <w:t>Могу самостоятельно разбираться в процессе, фиксировать договорённости и доводить задачу до проверяемого результата.</w:t>
+      </w:r>
+    </w:p>
+    <w:p>
+      <w:pPr>
+        <w:numPr>
+          <w:ilvl w:val="0"/>
+          <w:numId w:val="10"/>
+        </w:numPr>
+        <w:pStyle w:val="ResumeBullet"/>
+      </w:pPr>
+      <w:r>
+        <w:rPr>
+          <w:rFonts w:ascii="Calibri" w:hAnsi="Calibri"/>
+          <w:b w:val="0"/>
+          <w:i w:val="0"/>
+          <w:color w:val="243B53"/>
+          <w:sz w:val="22"/>
+        </w:rPr>
+        <w:t>Подходит удалённая коммуникация в Telegram/email, работа с GitHub, документацией, таблицами и задачами.</w:t>
       </w:r>
     </w:p>
     <w:p>
@@ -1468,7 +1598,7 @@
         <w:color w:val="52667A"/>
         <w:sz w:val="18"/>
       </w:rPr>
-      <w:t>РЕЗЮМЕ  •  PYTHON / TELEGRAM / WEB</w:t>
+      <w:t>РЕЗЮМЕ  •  CRM / SALESOPS / BUSINESS ANALYST / PYTHON</w:t>
     </w:r>
   </w:p>
 </w:hdr>

</xml_diff>